<commit_message>
Manuel malagasy T5 : dossier sources_web (10 loharano) + note de relecture sur la structure du PE
- collect_web.py : comptage des fiches par position (comme le manuel), mention des clés non encore citées
- sources_web/ + output/Loharanon-kevitra_Web_T5_V1.zip : 12 fichiers, référence + URL + licence +
  passages verbatim + fiches utilisatrices pour chaque page web du contenu
- Corrections-structure-PE.md : les 5 corrections relevées dans le PE (9 seho, Tsipelina et Fitsipiky
  ny teny séparés, tableau des mari-piatoana, entraînement avant l'évaluation, exemples du PE) et ce
  qui est déjà tranché

Co-authored-by: arena-agent <297053741+arena-agent@users.noreply.github.com>
</commit_message>
<xml_diff>
--- a/manuel-malagasy-t5/sources_web/RECAPITULATIF.docx
+++ b/manuel-malagasy-t5/sources_web/RECAPITULATIF.docx
@@ -18,7 +18,7 @@
           <w:i/>
           <w:sz w:val="20"/>
         </w:rPr>
-        <w:t>Manuel Fiteny Malagasy T5 · 10 loharano voamarina · thèmes 1 à 5 (33 fiches)</w:t>
+        <w:t>Manuel Fiteny Malagasy T5 · 10 loharano voamarina · 21 fiches déjà écrites, avec 33 renvois vers ces sources</w:t>
       </w:r>
     </w:p>
     <w:p>
@@ -92,7 +92,7 @@
         <w:rPr>
           <w:sz w:val="18"/>
         </w:rPr>
-        <w:t>→ cité dans : loha1 · fiche 1 · Vakiteny (vakiteny miaina sy fahazoan-dahatsoratra) · « Fandroana ny Tanana »</w:t>
+        <w:t>→ cité dans : loha1 · fiche 2 · Vakiteny (vakiteny miaina sy fahazoan-dahatsoratra) · « Fandroana ny Tanana »</w:t>
       </w:r>
     </w:p>
     <w:p>
@@ -278,7 +278,7 @@
         <w:rPr>
           <w:sz w:val="18"/>
         </w:rPr>
-        <w:t>→ cité dans : loha1 · fiche 1 · Vakiteny (vakiteny miaina sy fahazoan-dahatsoratra) · « Fandroana ny Tanana »</w:t>
+        <w:t>→ cité dans : loha1 · fiche 2 · Vakiteny (vakiteny miaina sy fahazoan-dahatsoratra) · « Fandroana ny Tanana »</w:t>
       </w:r>
     </w:p>
     <w:p>
@@ -377,7 +377,7 @@
         <w:rPr>
           <w:sz w:val="18"/>
         </w:rPr>
-        <w:t>→ cité dans : loha1 · fiche 1 · Vakiteny (vakiteny miaina sy fahazoan-dahatsoratra) · « Fandroana ny Tanana »</w:t>
+        <w:t>→ cité dans : loha1 · fiche 2 · Vakiteny (vakiteny miaina sy fahazoan-dahatsoratra) · « Fandroana ny Tanana »</w:t>
       </w:r>
     </w:p>
     <w:p>
@@ -401,7 +401,7 @@
         <w:rPr>
           <w:sz w:val="18"/>
         </w:rPr>
-        <w:t>→ cité dans : loha2 · fiche 6 · Vakiteny (vakiteny miaina sy fahazoan-dahatsoratra) · « Ny teny mahery lava noho ny tanana »</w:t>
+        <w:t>→ cité dans : loha2 · fiche 2 · Vakiteny (vakiteny miaina sy fahazoan-dahatsoratra) · « Ny teny mahery lava noho ny tanana »</w:t>
       </w:r>
     </w:p>
     <w:p>
@@ -413,7 +413,7 @@
         <w:rPr>
           <w:sz w:val="18"/>
         </w:rPr>
-        <w:t>→ cité dans : loha2 · fiche 8 · Asa an-tsoratra · « Lahatsoratra momba ny fifanajana »</w:t>
+        <w:t>→ cité dans : loha2 · fiche 4 · Asa an-tsoratra · « Lahatsoratra momba ny fifanajana »</w:t>
       </w:r>
     </w:p>
     <w:p>
@@ -425,7 +425,7 @@
         <w:rPr>
           <w:sz w:val="18"/>
         </w:rPr>
-        <w:t>→ cité dans : loha3 · fiche 10 · Vakiteny (vakiteny miaina sy fahazoan-dahatsoratra) · « Ny ala sy ny renirano »</w:t>
+        <w:t>→ cité dans : loha3 · fiche 2 · Vakiteny (vakiteny miaina sy fahazoan-dahatsoratra) · « Ny ala sy ny renirano »</w:t>
       </w:r>
     </w:p>
     <w:p>
@@ -437,7 +437,7 @@
         <w:rPr>
           <w:sz w:val="18"/>
         </w:rPr>
-        <w:t>→ cité dans : loha3 · fiche 12 · Asa an-tsoratra · « Lahatsoratra fampahafantarana : ny fiarovana ny tontolo manodidina »</w:t>
+        <w:t>→ cité dans : loha3 · fiche 4 · Asa an-tsoratra · « Lahatsoratra fampahafantarana : ny fiarovana ny tontolo manodidina »</w:t>
       </w:r>
     </w:p>
     <w:p>
@@ -449,7 +449,7 @@
         <w:rPr>
           <w:sz w:val="18"/>
         </w:rPr>
-        <w:t>→ cité dans : loha4 · fiche 14 · Vakiteny (vakiteny miaina sy fahazoan-dahatsoratra) · « Ny zo mitovy tao amin'ny kilasy »</w:t>
+        <w:t>→ cité dans : loha4 · fiche 2 · Vakiteny (vakiteny miaina sy fahazoan-dahatsoratra) · « Ny zo mitovy tao amin'ny kilasy »</w:t>
       </w:r>
     </w:p>
     <w:p>
@@ -461,7 +461,7 @@
         <w:rPr>
           <w:sz w:val="18"/>
         </w:rPr>
-        <w:t>→ cité dans : loha4 · fiche 16 · Asa an-tsoratra · « Lahatsoratra adihevitra : ny zo mitovy eto amin'ny kilasy »</w:t>
+        <w:t>→ cité dans : loha4 · fiche 4 · Asa an-tsoratra · « Lahatsoratra adihevitra : ny zo mitovy eto amin'ny kilasy »</w:t>
       </w:r>
     </w:p>
     <w:p>
@@ -473,7 +473,7 @@
         <w:rPr>
           <w:sz w:val="18"/>
         </w:rPr>
-        <w:t>→ cité dans : loha5 · fiche 18 · Vakiteny (vakiteny miaina sy fahazoan-dahatsoratra) · « Fivoriana ao amin'ny tanàna »</w:t>
+        <w:t>→ cité dans : loha5 · fiche 2 · Vakiteny (vakiteny miaina sy fahazoan-dahatsoratra) · « Fivoriana ao amin'ny tanàna »</w:t>
       </w:r>
     </w:p>
     <w:p>
@@ -485,7 +485,7 @@
         <w:rPr>
           <w:sz w:val="18"/>
         </w:rPr>
-        <w:t>→ cité dans : loha5 · fiche 20 · Asa an-tsoratra · « Lahatsoratra fampahafantarana : ny asa iombonana ao amin'ny tanàna »</w:t>
+        <w:t>→ cité dans : loha5 · fiche 4 · Asa an-tsoratra · « Lahatsoratra fampahafantarana : ny asa iombonana ao amin'ny tanàna »</w:t>
       </w:r>
     </w:p>
     <w:p>
@@ -560,7 +560,7 @@
         <w:rPr>
           <w:sz w:val="18"/>
         </w:rPr>
-        <w:t>→ cité dans : loha2 · fiche 7 · Fiasan'ny teny · « Ny tendro sy ny teny miafara amin'ny -ka, -tra, -na »</w:t>
+        <w:t>→ cité dans : loha2 · fiche 3 · Fiasan'ny teny · « Ny tendro sy ny teny miafara amin'ny -ka, -tra, -na »</w:t>
       </w:r>
     </w:p>
     <w:p>
@@ -647,7 +647,7 @@
         <w:rPr>
           <w:sz w:val="18"/>
         </w:rPr>
-        <w:t>→ cité dans : loha2 · fiche 5 · Fanehoan-kevitra am-bava · « Ny fifanajana amin'ny fitenenana »</w:t>
+        <w:t>→ cité dans : loha2 · fiche 1 · Fanehoan-kevitra am-bava · « Ny fifanajana amin'ny fitenenana »</w:t>
       </w:r>
     </w:p>
     <w:p>
@@ -659,7 +659,7 @@
         <w:rPr>
           <w:sz w:val="18"/>
         </w:rPr>
-        <w:t>→ cité dans : loha2 · fiche 6 · Vakiteny (vakiteny miaina sy fahazoan-dahatsoratra) · « Ny teny mahery lava noho ny tanana »</w:t>
+        <w:t>→ cité dans : loha2 · fiche 2 · Vakiteny (vakiteny miaina sy fahazoan-dahatsoratra) · « Ny teny mahery lava noho ny tanana »</w:t>
       </w:r>
     </w:p>
     <w:p>
@@ -746,7 +746,7 @@
         <w:rPr>
           <w:sz w:val="18"/>
         </w:rPr>
-        <w:t>→ cité dans : loha2 · fiche 5 · Fanehoan-kevitra am-bava · « Ny fifanajana amin'ny fitenenana »</w:t>
+        <w:t>→ cité dans : loha2 · fiche 1 · Fanehoan-kevitra am-bava · « Ny fifanajana amin'ny fitenenana »</w:t>
       </w:r>
     </w:p>
     <w:p>
@@ -758,7 +758,7 @@
         <w:rPr>
           <w:sz w:val="18"/>
         </w:rPr>
-        <w:t>→ cité dans : loha2 · fiche 8 · Asa an-tsoratra · « Lahatsoratra momba ny fifanajana »</w:t>
+        <w:t>→ cité dans : loha2 · fiche 4 · Asa an-tsoratra · « Lahatsoratra momba ny fifanajana »</w:t>
       </w:r>
     </w:p>
     <w:p>
@@ -770,7 +770,7 @@
         <w:rPr>
           <w:sz w:val="18"/>
         </w:rPr>
-        <w:t>→ cité dans : loha4 · fiche 13 · Fanehoan-kevitra am-bava · « Fijoroana manohana ny namana voafoize »</w:t>
+        <w:t>→ cité dans : loha4 · fiche 1 · Fanehoan-kevitra am-bava · « Fijoroana manohana ny namana voafoize »</w:t>
       </w:r>
     </w:p>
     <w:p>
@@ -845,7 +845,7 @@
         <w:rPr>
           <w:sz w:val="18"/>
         </w:rPr>
-        <w:t>→ cité dans : loha3 · fiche 9 · Fanehoan-kevitra am-bava · « Ny fiarovana ny ala sy ny rano »</w:t>
+        <w:t>→ cité dans : loha3 · fiche 1 · Fanehoan-kevitra am-bava · « Ny fiarovana ny ala sy ny rano »</w:t>
       </w:r>
     </w:p>
     <w:p>
@@ -857,7 +857,7 @@
         <w:rPr>
           <w:sz w:val="18"/>
         </w:rPr>
-        <w:t>→ cité dans : loha3 · fiche 10 · Vakiteny (vakiteny miaina sy fahazoan-dahatsoratra) · « Ny ala sy ny renirano »</w:t>
+        <w:t>→ cité dans : loha3 · fiche 2 · Vakiteny (vakiteny miaina sy fahazoan-dahatsoratra) · « Ny ala sy ny renirano »</w:t>
       </w:r>
     </w:p>
     <w:p>
@@ -869,7 +869,7 @@
         <w:rPr>
           <w:sz w:val="18"/>
         </w:rPr>
-        <w:t>→ cité dans : loha3 · fiche 12 · Asa an-tsoratra · « Lahatsoratra fampahafantarana : ny fiarovana ny tontolo manodidina »</w:t>
+        <w:t>→ cité dans : loha3 · fiche 4 · Asa an-tsoratra · « Lahatsoratra fampahafantarana : ny fiarovana ny tontolo manodidina »</w:t>
       </w:r>
     </w:p>
     <w:p>
@@ -956,7 +956,7 @@
         <w:rPr>
           <w:sz w:val="18"/>
         </w:rPr>
-        <w:t>→ cité dans : loha4 · fiche 13 · Fanehoan-kevitra am-bava · « Fijoroana manohana ny namana voafoize »</w:t>
+        <w:t>→ cité dans : loha4 · fiche 1 · Fanehoan-kevitra am-bava · « Fijoroana manohana ny namana voafoize »</w:t>
       </w:r>
     </w:p>
     <w:p>
@@ -968,7 +968,7 @@
         <w:rPr>
           <w:sz w:val="18"/>
         </w:rPr>
-        <w:t>→ cité dans : loha4 · fiche 14 · Vakiteny (vakiteny miaina sy fahazoan-dahatsoratra) · « Ny zo mitovy tao amin'ny kilasy »</w:t>
+        <w:t>→ cité dans : loha4 · fiche 2 · Vakiteny (vakiteny miaina sy fahazoan-dahatsoratra) · « Ny zo mitovy tao amin'ny kilasy »</w:t>
       </w:r>
     </w:p>
     <w:p>
@@ -980,7 +980,7 @@
         <w:rPr>
           <w:sz w:val="18"/>
         </w:rPr>
-        <w:t>→ cité dans : loha4 · fiche 15 · Fiasan'ny teny · « « Noho ny », « nony », « no ho » »</w:t>
+        <w:t>→ cité dans : loha4 · fiche 3 · Fiasan'ny teny · « « Noho ny », « nony », « no ho » »</w:t>
       </w:r>
     </w:p>
     <w:p>
@@ -992,7 +992,7 @@
         <w:rPr>
           <w:sz w:val="18"/>
         </w:rPr>
-        <w:t>→ cité dans : loha4 · fiche 16 · Asa an-tsoratra · « Lahatsoratra adihevitra : ny zo mitovy eto amin'ny kilasy »</w:t>
+        <w:t>→ cité dans : loha4 · fiche 4 · Asa an-tsoratra · « Lahatsoratra adihevitra : ny zo mitovy eto amin'ny kilasy »</w:t>
       </w:r>
     </w:p>
     <w:p>
@@ -1091,7 +1091,7 @@
         <w:rPr>
           <w:sz w:val="18"/>
         </w:rPr>
-        <w:t>→ cité dans : loha5 · fiche 17 · Fanehoan-kevitra am-bava · « Ny fandraisana anjara amin'ny resaka iombonana »</w:t>
+        <w:t>→ cité dans : loha5 · fiche 1 · Fanehoan-kevitra am-bava · « Ny fandraisana anjara amin'ny resaka iombonana »</w:t>
       </w:r>
     </w:p>
     <w:p>
@@ -1103,7 +1103,7 @@
         <w:rPr>
           <w:sz w:val="18"/>
         </w:rPr>
-        <w:t>→ cité dans : loha5 · fiche 18 · Vakiteny (vakiteny miaina sy fahazoan-dahatsoratra) · « Fivoriana ao amin'ny tanàna »</w:t>
+        <w:t>→ cité dans : loha5 · fiche 2 · Vakiteny (vakiteny miaina sy fahazoan-dahatsoratra) · « Fivoriana ao amin'ny tanàna »</w:t>
       </w:r>
     </w:p>
     <w:p>
@@ -1115,7 +1115,7 @@
         <w:rPr>
           <w:sz w:val="18"/>
         </w:rPr>
-        <w:t>→ cité dans : loha5 · fiche 20 · Asa an-tsoratra · « Lahatsoratra fampahafantarana : ny asa iombonana ao amin'ny tanàna »</w:t>
+        <w:t>→ cité dans : loha5 · fiche 4 · Asa an-tsoratra · « Lahatsoratra fampahafantarana : ny asa iombonana ao amin'ny tanàna »</w:t>
       </w:r>
     </w:p>
     <w:p>

</xml_diff>